<commit_message>
docs: add Aya Benjilali as co-trainee
</commit_message>
<xml_diff>
--- a/docs/Rapport_Stage_Observation_CGI_Mehdi_Lharti_InfraSentinel_Illustre.docx
+++ b/docs/Rapport_Stage_Observation_CGI_Mehdi_Lharti_InfraSentinel_Illustre.docx
@@ -186,7 +186,7 @@
               <w:rPr>
                 <w:b/>
               </w:rPr>
-              <w:t>Stagiaire</w:t>
+              <w:t>Stagiaires</w:t>
             </w:r>
           </w:p>
         </w:tc>
@@ -214,7 +214,7 @@
               </w:rPr>
             </w:pPr>
             <w:r>
-              <w:t>Mehdi Lharti</w:t>
+              <w:t>Mehdi Lharti et Aya Benjilali</w:t>
             </w:r>
           </w:p>
         </w:tc>
@@ -3855,7 +3855,7 @@
               <w:rPr>
                 <w:b/>
               </w:rPr>
-              <w:t>Stagiaire</w:t>
+              <w:t>Stagiaires</w:t>
             </w:r>
           </w:p>
         </w:tc>
@@ -3883,7 +3883,7 @@
               </w:rPr>
             </w:pPr>
             <w:r>
-              <w:t>Mehdi Lharti</w:t>
+              <w:t>Mehdi Lharti et Aya Benjilali</w:t>
             </w:r>
           </w:p>
         </w:tc>

</xml_diff>